<commit_message>
Anúncios: gerar título e descrições do produto; garantia não cobre mau uso
- Botão Anunciar no produto: novo/seminovo, garantia, entrega, cartão; descrição curta e completa com copiar; fotos para baixar.
- Padrão de anúncio salvo por empresa (settings.listing).
- Configurações: texto padrão de garantia (só defeitos do equipamento; não cobre mau uso).
- Termo de garantia e contrato de venda: cláusula de mau uso.
- PUT /tenant parcial não apaga mais o e-mail da empresa.

Co-Authored-By: Claude Opus 5.5 <noreply@anthropic.com>
Claude-Session: https://claude.ai/code/session_01VYjRqbEPcVhSnAUWDW8z1f
</commit_message>
<xml_diff>
--- a/docs/modelos/Termo_garantia_celular_3_meses.docx
+++ b/docs/modelos/Termo_garantia_celular_3_meses.docx
@@ -237,7 +237,7 @@
         <w:rPr>
           <w:b w:val="0"/>
         </w:rPr>
-        <w:t xml:space="preserve">Defeitos de funcionamento do aparelho que se manifestem durante o prazo e não decorram de uso inadequado, incluindo tela e toque sem dano físico, placa, câmeras, alto-falante e microfone, conectores, botões, rede móvel, Wi-Fi, Bluetooth, biometria e carga.</w:t>
+        <w:t xml:space="preserve">A garantia cobre somente problemas do próprio equipamento: defeitos de fabricação ou de funcionamento que se manifestem durante o prazo sem causa externa, incluindo tela e toque sem dano físico, placa, câmeras, alto-falante e microfone, conectores, botões, rede móvel, Wi-Fi, Bluetooth, biometria e carga.</w:t>
       </w:r>
     </w:p>
     <w:p>
@@ -262,6 +262,14 @@
       </w:pPr>
       <w:r>
         <w:t xml:space="preserve">5 O que a garantia não cobre</w:t>
+      </w:r>
+    </w:p>
+    <w:p>
+      <w:r>
+        <w:rPr>
+          <w:b w:val="0"/>
+        </w:rPr>
+        <w:t xml:space="preserve">A garantia não cobre mau uso, entendido como qualquer dano ou falha causados pelo uso em desacordo com as orientações do fabricante ou da loja, por acidente ou por agente externo após a entrega. Constatado mau uso, o atendimento não é coberto por esta garantia.</w:t>
       </w:r>
     </w:p>
     <w:p>

</xml_diff>